<commit_message>
feat: agregar sección de video demo al final de la página
Agrega el video de WhatsApp al proyecto con un reproductor nativo
embebido en una nueva sección al pie de index.html, con estilos
consistentes con el sistema de diseño existente. También mejora
CLAUDE.md con convenciones HTML de componentes.

Co-Authored-By: Claude Sonnet 4.6 <noreply@anthropic.com>
</commit_message>
<xml_diff>
--- a/guia ellie care.docx
+++ b/guia ellie care.docx
@@ -12,15 +12,6 @@
           <w:szCs w:val="32"/>
         </w:rPr>
       </w:pPr>
-      <w:r>
-        <w:rPr>
-          <w:b/>
-          <w:bCs/>
-          <w:sz w:val="32"/>
-          <w:szCs w:val="32"/>
-        </w:rPr>
-        <w:t>6</w:t>
-      </w:r>
       <w:r>
         <w:rPr>
           <w:b/>

</xml_diff>